<commit_message>
feat(sync): connect v5 resource sync client
</commit_message>
<xml_diff>
--- a/jackyun-portal/docs/sync-resource-v5-3.45.0.docx
+++ b/jackyun-portal/docs/sync-resource-v5-3.45.0.docx
@@ -22,7 +22,7 @@
     </w:p>
     <w:p>
       <w:r>
-        <w:t xml:space="preserve">结论：本次交付修复 v4 Gzip 协商和分片接收进度，并新增默认关闭的 v5 服务端协议、资源模型、数据库迁移及 v4 兼容桥基础。Portal 客户端尚未接入 v5 原子拉取/队列，因此本版本不能启用生产账号灰度，也不能视为资源级同步已完成。</w:t>
+        <w:t xml:space="preserve">结论：本次交付修复 v4 Gzip 协商、分片进度与 v5 兼容投影问题，并接通默认关闭的 v5 客户端资源存储、按页面拉取、离线操作队列、原子游标提交和冲突处理。代码与本地专项验证已覆盖主要闭环；真实 PostgreSQL 迁移、生产认证读写和跨设备验收仍未完成，因此不得启用生产账号灰度。</w:t>
       </w:r>
     </w:p>
     <w:p>
@@ -65,7 +65,12 @@
     </w:p>
     <w:p>
       <w:r>
-        <w:t xml:space="preserve">Azure 增加 v5 capabilities、manifest、changes、records、operations 与 receipts 路由。写入校验资源范围、正文大小、设备状态、条件版本、幂等操作 ID，并实施每用户每分钟 600 操作上限。冲突返回当前远端记录，不覆盖数据。SQL 迁移是新增表及 RLS 策略，不会删除 v4 数据。</w:t>
+        <w:t xml:space="preserve">Portal 客户端按页面资源范围读取 capabilities、manifest/changes 与资源正文；正文按 SHA-256 校验后，资源记录、合并后的本地 Schedule 文档及游标在同一个 IndexedDB 读写事务提交。记录变化使用本地持久 outbox、稳定操作 ID 与服务端 receipt 恢复；CAS 冲突保留两份内容，并在同步中心提供明确的本机/云端选择。已有待确认修改不会因 v5 不可用而自动切换成旧 Schedule 上传。</w:t>
+      </w:r>
+    </w:p>
+    <w:p>
+      <w:r>
+        <w:t xml:space="preserve">Azure 增加 v5 capabilities、manifest、changes、records、operations 与 receipts 路由。写入校验资源范围、正文大小、设备状态、条件版本、幂等操作 ID，并实施每用户每分钟 600 操作上限。changes 日志保留 90 天，游标过期时要求重新建立基线；冲突返回当前远端记录，不覆盖数据。SQL 迁移是新增表及 RLS 策略，不会删除 v4 数据。</w:t>
       </w:r>
     </w:p>
     <w:p>
@@ -79,12 +84,12 @@
     </w:p>
     <w:p>
       <w:r>
-        <w:t xml:space="preserve">v5 与 v4 使用同一用户写事务。v5 投影提交时同步更新 legacy Schedule 行的 revision、content_hash、updated_at，并追加 v4 变化日志；已存在的多兆字节 storage_value 不随单条资源变更重写。这样 v4 的过期 revision/hash 条件写入会进入冲突流程，旧客户端读取则通过兼容投影获得合并后的 Schedule。投影重建耗时随 v5 写入结果返回，便于后续实测。</w:t>
-      </w:r>
-    </w:p>
-    <w:p>
-      <w:r>
-        <w:t xml:space="preserve">灰度仅由服务端账号白名单 SYNC_V5_USERS 与资源范围 SYNC_V5_SCOPES 共同控制，不存在全局启用开关。任一 v5 写入失败都不得把旧快照自动转成 v4 全量写入。回滚时先移除测试账号白名单并确认接口回到 v4；保留 v5 表、回执和本地待同步数据，不通过删除数据表或覆盖 Schedule 来回滚。</w:t>
+        <w:t xml:space="preserve">v5 与 v4 使用同一用户写事务。v5 投影提交时同步更新 legacy Schedule 行的 revision、content_hash、updated_at，并追加 v4 变化日志；已存在的多兆字节 storage_value 不随单条资源变更重写。这样 v4 的过期 revision/hash 条件写入会进入冲突流程，旧客户端读取则通过兼容投影获得合并后的 Schedule。移除 v5 写入白名单后，只要账号已有投影头且 v5 表可用，v4 兼容桥仍会继续读取和维护投影；仅关闭白名单不是回滚旧兼容代码的授权。</w:t>
+      </w:r>
+    </w:p>
+    <w:p>
+      <w:r>
+        <w:t xml:space="preserve">任一 v5 写入失败都不得把旧快照自动转成 v4 全量写入。若回退 Azure Functions 到不含兼容桥的旧二进制，可能使 legacy storage_value 与已推进的 revision/hash 不匹配；在部署这种旧版本前必须先物化并哈希校验完整 Schedule 正文，或保留兼容桥版本。v5 表、回执和本地待同步数据不得因回滚而删除。</w:t>
       </w:r>
     </w:p>
     <w:p>
@@ -253,7 +258,7 @@
           </w:tcPr>
           <w:p>
             <w:r>
-              <w:t xml:space="preserve">资源模型与服务端兼容桥基础已实现；客户端 v5 IndexedDB 原子事务尚未完成，禁止灰度。</w:t>
+              <w:t xml:space="preserve">客户端资源存储、页内原子提交、离线操作及冲突决策已接入；真实 PostgreSQL 双向一致性与回滚仍待验证。</w:t>
             </w:r>
           </w:p>
         </w:tc>
@@ -288,7 +293,7 @@
           </w:tcPr>
           <w:p>
             <w:r>
-              <w:t xml:space="preserve">未完成；当前定义资源范围，不代表页面读取已切换。</w:t>
+              <w:t xml:space="preserve">按路由选择同步范围已实现；生产侧分资源灰度保持关闭，需先完成数据库迁移及测试账号验收。</w:t>
             </w:r>
           </w:p>
         </w:tc>
@@ -340,12 +345,12 @@
     </w:p>
     <w:p>
       <w:r>
-        <w:t xml:space="preserve">已通过：完整 npm run test:sync 共 192 项；Azure backend npm test 共 28 项；v5 CAS/回执/冲突测试；资源模型往返、单条 CUE 编辑影响范围和重复 ID 拒绝测试；v4 Gzip 上传协商、压缩传输及分片恢复测试；Next.js 16.3.8 production build；Azure Functions 3.8.0 打包构建；目标文件 ESLint 与 Node 语法检查。</w:t>
-      </w:r>
-    </w:p>
-    <w:p>
-      <w:r>
-        <w:t xml:space="preserve">仍需执行：v4/v5 真实 PostgreSQL 事务集成测试，覆盖旧写冲突、兼容投影哈希、资源删除墓碑及并发操作；生产数据库迁移与认证读写验收；浏览器端 v5 IndexedDB 原子页提交和游标推进目前未实现。</w:t>
+        <w:t xml:space="preserve">已通过：完整 npm run test:sync 共 198 项；Azure backend node --test 共 32 项，其中新增 Azure HTTP 入口路由测试；v5 CAS/回执/冲突、未知字段兼容、投影关闭白名单后仍可读取、IndexedDB 原子资源与游标提交、页面资源拉取、可恢复本地队列及多标签页恢复测试；v4 Gzip 上传与分片进度测试；ESLint 0 错误（保留 2 条既有 warning）；Next.js 16.3.8 production build；Azure Functions 3.8.0 打包构建；密钥扫描。</w:t>
+      </w:r>
+    </w:p>
+    <w:p>
+      <w:r>
+        <w:t xml:space="preserve">仍需执行：v4/v5 真实 PostgreSQL 事务集成测试，覆盖旧写冲突、兼容投影哈希、资源删除墓碑及并发操作；生产数据库迁移与认证读写验收；手机和电脑跨设备验证。接口返回 projectionBuildMs、projectionRecordCount 与 projectionBytes；数据库层记录 sqlCount、databaseMs 和 poolWaitMs。单条资源仍会扫描并组装兼容投影，服务端负载是否改善须用相同基线实测，不能由客户端流量减少推断。</w:t>
       </w:r>
     </w:p>
     <w:p>
@@ -388,7 +393,7 @@
     </w:p>
     <w:p>
       <w:r>
-        <w:t xml:space="preserve">回滚：移除账号白名单，确认所有设备继续使用 v4；检查本地操作仍在持久队列中、没有因 v5 失败触发 v4 覆盖；保留数据库 v5 记录和回执以供诊断。不能仅因 PR 合并成功或 Vercel READY 就宣布同步验收完成。</w:t>
+        <w:t xml:space="preserve">回滚：移除账号白名单后，先验证所有设备回到 v4 写入且兼容桥继续返回最新投影；检查本地操作仍在持久队列中、没有因 v5 失败触发 v4 覆盖；保留数据库 v5 记录和回执以供诊断。若需要回退 Functions 兼容代码，先将投影物化到 legacy storage_value 并校验正文哈希。不能仅因 PR 合并成功或 Vercel READY 就宣布同步验收完成。</w:t>
       </w:r>
     </w:p>
     <w:p>

</xml_diff>

<commit_message>
docs(sync): record CI and preview acceptance
</commit_message>
<xml_diff>
--- a/jackyun-portal/docs/sync-resource-v5-3.45.0.docx
+++ b/jackyun-portal/docs/sync-resource-v5-3.45.0.docx
@@ -188,7 +188,7 @@
           </w:tcPr>
           <w:p>
             <w:r>
-              <w:t xml:space="preserve">已实现；通过本地聚焦测试，待 CI 和部署后复核。</w:t>
+              <w:t xml:space="preserve">已实现并通过本地专项测试；GitHub Actions 的 build/type/lint 通过，Existing data safety regressions 步骤目前失败，需先清理未改动模块的既有回归。</w:t>
             </w:r>
           </w:p>
         </w:tc>
@@ -369,7 +369,12 @@
     </w:p>
     <w:p>
       <w:r>
-        <w:t xml:space="preserve">生产验收必须记录 Vercel READY 对应 commit SHA、Azure Function 版本及运行健康信息，并使用专用测试账号完成认证读写、操作回执查询、再次读取及哈希比对。未提供的 Azure 日志、测试账号和第二设备不能由客户端日志或部署 READY 替代。</w:t>
+        <w:t xml:space="preserve">当前 PR head 0bf180073656d4324e243a2dcd2553805eb1d47c 的 Vercel Preview 已 READY；预览 /api/health 返回 200，未认证 /api/sync/v5 返回 v5=false。此结果只验证 Preview 路由与默认关闭，不代表生产部署或认证读写。生产验收必须记录 Vercel READY 对应 commit SHA、Azure Function 版本及运行健康信息，并使用专用测试账号完成认证读写、操作回执查询、再次读取及哈希比对。未提供的 Azure 日志、测试账号和第二设备不能由客户端日志或部署 READY 替代。</w:t>
+      </w:r>
+    </w:p>
+    <w:p>
+      <w:r>
+        <w:t xml:space="preserve">GitHub Actions run 40202627082 在 build 和 Type/lint checks 通过后，于 Existing data safety regressions 失败。失败测试涉及 cue-game、learning-domain、legacy-ui、music-sync、notification-polling、practice-cloud-frame、pwa 和 update-history 等未由本次改动触及的模块；需单独确认其基线状态并修复或正式豁免后，PR 才能满足 CI 合并门槛。</w:t>
       </w:r>
     </w:p>
     <w:p>

</xml_diff>

<commit_message>
fix(ci): repair stale regression checks
</commit_message>
<xml_diff>
--- a/jackyun-portal/docs/sync-resource-v5-3.45.0.docx
+++ b/jackyun-portal/docs/sync-resource-v5-3.45.0.docx
@@ -188,7 +188,7 @@
           </w:tcPr>
           <w:p>
             <w:r>
-              <w:t xml:space="preserve">已实现并通过本地专项测试；GitHub Actions 的 build/type/lint 通过，Existing data safety regressions 步骤目前失败，需先清理未改动模块的既有回归。</w:t>
+              <w:t xml:space="preserve">已实现；此前 GitHub Actions 暴露的测试入口、过期断言、仓库 mock、更新精选和时钟边界均已修复；当前完整回归本地通过，等待远端复跑。</w:t>
             </w:r>
           </w:p>
         </w:tc>
@@ -345,7 +345,7 @@
     </w:p>
     <w:p>
       <w:r>
-        <w:t xml:space="preserve">已通过：完整 npm run test:sync 共 198 项；Azure backend node --test 共 32 项，其中新增 Azure HTTP 入口路由测试；v5 CAS/回执/冲突、未知字段兼容、投影关闭白名单后仍可读取、IndexedDB 原子资源与游标提交、页面资源拉取、可恢复本地队列及多标签页恢复测试；v4 Gzip 上传与分片进度测试；ESLint 0 错误（保留 2 条既有 warning）；Next.js 16.3.8 production build；Azure Functions 3.8.0 打包构建；密钥扫描。</w:t>
+        <w:t xml:space="preserve">已通过：完整 CI 回归命令 node --test tests/*.test.mts tests/*.test.mjs 共 898 项；npm run test:sync 共 199 项；Azure backend node --test 共 32 项，其中包含 Azure HTTP 入口路由测试；v5 CAS/回执/冲突、未知字段兼容、投影关闭白名单后仍可读取、IndexedDB 原子资源与游标提交、页面资源拉取、可恢复本地队列及多标签页恢复测试；v4 Gzip 上传与分片进度测试；ESLint 0 错误（保留 2 条既有 warning）；Next.js 16.3.8 production build；Azure Functions 3.8.0 打包构建；密钥扫描。</w:t>
       </w:r>
     </w:p>
     <w:p>
@@ -374,7 +374,7 @@
     </w:p>
     <w:p>
       <w:r>
-        <w:t xml:space="preserve">GitHub Actions run 40202627082 在 build 和 Type/lint checks 通过后，于 Existing data safety regressions 失败。失败测试涉及 cue-game、learning-domain、legacy-ui、music-sync、notification-polling、practice-cloud-frame、pwa 和 update-history 等未由本次改动触及的模块；需单独确认其基线状态并修复或正式豁免后，PR 才能满足 CI 合并门槛。</w:t>
+        <w:t xml:space="preserve">GitHub Actions run 40203515973 曾在 Existing data safety regressions 失败。针对失败结果已修复 Node 测试 alias、旧测试夹具/断言、学习工具 ARIA 关联、唯一精选版本及音乐同步时间边界；当前对应 898 项完整回归在本地全部通过。该修复提交后的 GitHub Actions 结果仍需等待，不得把本地通过等同为远端 CI 通过。</w:t>
       </w:r>
     </w:p>
     <w:p>

</xml_diff>

<commit_message>
fix(sync): isolate v5 account and rollback paths
</commit_message>
<xml_diff>
--- a/jackyun-portal/docs/sync-resource-v5-3.45.0.docx
+++ b/jackyun-portal/docs/sync-resource-v5-3.45.0.docx
@@ -65,7 +65,7 @@
     </w:p>
     <w:p>
       <w:r>
-        <w:t xml:space="preserve">Portal 客户端按页面资源范围读取 capabilities、manifest/changes 与资源正文；正文按 SHA-256 校验后，资源记录、合并后的本地 Schedule 文档及游标在同一个 IndexedDB 读写事务提交。记录变化使用本地持久 outbox、稳定操作 ID 与服务端 receipt 恢复；CAS 冲突保留两份内容，并在同步中心提供明确的本机/云端选择。已有待确认修改不会因 v5 不可用而自动切换成旧 Schedule 上传。</w:t>
+        <w:t xml:space="preserve">Portal 客户端按页面资源范围读取 capabilities、manifest/changes 与资源正文；正文按 SHA-256 校验后，资源记录、合并后的本地 Schedule 文档及游标在同一个 IndexedDB 读写事务提交。每个 v5 worker 显式绑定创建时账号的 IndexedDB namespace；账号切换后尚未提交的网络响应会被丢弃，不能写入新账号或全局数据库。记录变化使用本地持久 outbox、稳定操作 ID 与服务端 receipt 恢复；CAS 冲突保留两份内容，并在同步中心提供明确的本机/云端选择。灰度撤销会清除客户端 v5 Schedule 所有权标记，使后续周期恢复 v4 路径；服务端版本 CAS 和兼容投影承担冲突保护。</w:t>
       </w:r>
     </w:p>
     <w:p>
@@ -89,7 +89,7 @@
     </w:p>
     <w:p>
       <w:r>
-        <w:t xml:space="preserve">任一 v5 写入失败都不得把旧快照自动转成 v4 全量写入。若回退 Azure Functions 到不含兼容桥的旧二进制，可能使 legacy storage_value 与已推进的 revision/hash 不匹配；在部署这种旧版本前必须先物化并哈希校验完整 Schedule 正文，或保留兼容桥版本。v5 表、回执和本地待同步数据不得因回滚而删除。</w:t>
+        <w:t xml:space="preserve">任一 v5 写入失败都不得把旧快照自动转成 v4 全量写入。只有服务端明确撤销 v5 capability 后客户端才清除资源所有权；下一个 v4 写仍依赖兼容投影的 revision/hash CAS，过期内容进入冲突而非覆盖。兼容桥还会对展开后的当前 v5 投影重新执行 Schedule 不可变证据检查，不能只依据可能过期的 legacy 正文。若回退 Azure Functions 到不含兼容桥的旧二进制，可能使 legacy storage_value 与已推进的 revision/hash 不匹配；在部署这种旧版本前必须先物化并哈希校验完整 Schedule 正文，或保留兼容桥版本。v5 表、回执和本地待同步数据不得因回滚而删除。</w:t>
       </w:r>
     </w:p>
     <w:p>
@@ -188,7 +188,7 @@
           </w:tcPr>
           <w:p>
             <w:r>
-              <w:t xml:space="preserve">已实现；此前 GitHub Actions 暴露的测试入口、过期断言、仓库 mock、更新精选和时钟边界均已修复；当前完整回归本地通过，等待远端复跑。</w:t>
+              <w:t xml:space="preserve">已实现；修复 GitHub Actions 暴露的测试入口、过期断言、仓库 mock、更新精选和时钟边界；并增加账号切换隔离、灰度撤销恢复、冲突保留和当前投影不可变证据校验。最新本地回归通过，最新远端 CI 仍在执行。</w:t>
             </w:r>
           </w:p>
         </w:tc>
@@ -345,7 +345,7 @@
     </w:p>
     <w:p>
       <w:r>
-        <w:t xml:space="preserve">已通过：完整 CI 回归命令 node --test tests/*.test.mts tests/*.test.mjs 共 898 项；npm run test:sync 共 199 项；Azure backend node --test 共 32 项，其中包含 Azure HTTP 入口路由测试；v5 CAS/回执/冲突、未知字段兼容、投影关闭白名单后仍可读取、IndexedDB 原子资源与游标提交、页面资源拉取、可恢复本地队列及多标签页恢复测试；v4 Gzip 上传与分片进度测试；ESLint 0 错误（保留 2 条既有 warning）；Next.js 16.3.8 production build；Azure Functions 3.8.0 打包构建；密钥扫描。</w:t>
+        <w:t xml:space="preserve">最新已通过：portal 完整回归 node --test tests/*.test.mts tests/*.test.mjs 共 901 项；test:sync 共 202 项；Azure backend node --test azure/backend/tests/*.test.mjs 共 33 项，含 Azure HTTP 路由与 v4/v5 投影安全测试；ESLint 0 错误（保留 2 条既有 warning）；Next.js 16.3.8 production build。专项还验证 v5 CAS/回执、未知字段投影、原子游标、账号 namespace 隔离、账号切换中止、撤销灰度、多个未决冲突保留、兼容桥不可变证据保护，以及 v4 Gzip 上传与分片进度。Azure Functions 打包构建与密钥扫描在前一提交通过；本轮仅改动共享处理逻辑和测试，仍须由推送后的 CI 重新确认。</w:t>
       </w:r>
     </w:p>
     <w:p>
@@ -369,12 +369,12 @@
     </w:p>
     <w:p>
       <w:r>
-        <w:t xml:space="preserve">当前 PR head 0bf180073656d4324e243a2dcd2553805eb1d47c 的 Vercel Preview 已 READY；预览 /api/health 返回 200，未认证 /api/sync/v5 返回 v5=false。此结果只验证 Preview 路由与默认关闭，不代表生产部署或认证读写。生产验收必须记录 Vercel READY 对应 commit SHA、Azure Function 版本及运行健康信息，并使用专用测试账号完成认证读写、操作回执查询、再次读取及哈希比对。未提供的 Azure 日志、测试账号和第二设备不能由客户端日志或部署 READY 替代。</w:t>
-      </w:r>
-    </w:p>
-    <w:p>
-      <w:r>
-        <w:t xml:space="preserve">GitHub Actions run 40203515973 曾在 Existing data safety regressions 失败。针对失败结果已修复 Node 测试 alias、旧测试夹具/断言、学习工具 ARIA 关联、唯一精选版本及音乐同步时间边界；当前对应 898 项完整回归在本地全部通过。该修复提交后的 GitHub Actions 结果仍需等待，不得把本地通过等同为远端 CI 通过。</w:t>
+        <w:t xml:space="preserve">PR head 238335a0b71b9c637be33acf8e9977f945c2999a 对应的 Vercel Preview 已 READY；预览 /api/health 返回 200，未认证 /api/sync/v5 返回 v5=false。该 Preview 只验证路由与默认关闭，不代表生产部署或认证读写。下一提交对应预览及 GitHub CI 需重新检查。生产验收必须记录 Vercel READY 对应 commit SHA、Azure Function 版本及运行健康信息，并使用专用测试账号完成认证读写、操作回执查询、再次读取及哈希比对。未提供的 Azure 日志、测试账号和第二设备不能由客户端日志或部署 READY 替代。</w:t>
+      </w:r>
+    </w:p>
+    <w:p>
+      <w:r>
+        <w:t xml:space="preserve">GitHub Actions run 40203515973 曾在 Existing data safety regressions 失败；该轮失败的 Node 测试 alias、旧测试夹具/断言、ARIA 关联、唯一精选版本及音乐同步时间边界已修复。修复提交 238335a 的 run 40206228983 已通过 build、Type/lint 和 Existing data safety regressions，但 Run production UI flows 最终失败，涉及 quiz-ui、IELTS dashboard、quick-task、legacy UI、study guide、music player、answer sheet、CUE route/search 与 review queue 浏览器流程。当前本地 901 项完整回归和专项同步 202 项通过；这些浏览器验收失败需在合并前逐项复现或确认基线，不能将绿色的同步子步骤等同于整个 CI 通过。新一批账号隔离/回滚/投影安全修复尚未推送，故 40206228983 不覆盖当前版本。</w:t>
       </w:r>
     </w:p>
     <w:p>

</xml_diff>

<commit_message>
fix(sync): preserve newer resource state and v4 compatibility
</commit_message>
<xml_diff>
--- a/jackyun-portal/docs/sync-resource-v5-3.45.0.docx
+++ b/jackyun-portal/docs/sync-resource-v5-3.45.0.docx
@@ -413,6 +413,108 @@
     <w:p>
       <w:r>
         <w:t xml:space="preserve">主要代码：src/lib/sync/engine.ts、src/lib/sync/resource-model.ts、azure/backend/sync-v5.mjs、azure/backend/sync-api.mjs、azure/sync-v5.sql，以及 /api/sync/v5 Next.js 转发路由。版本记录位于 Portal package 文件和 Azure backend package 文件。详细 SQL 运行限制见 azure/sync-v5.sql 与 azure/backend/README.md。</w:t>
+      </w:r>
+    </w:p>
+    <w:p>
+      <w:pPr>
+        <w:pStyle w:val="Heading1"/>
+      </w:pPr>
+      <w:r>
+        <w:t>9. PR 149 审查修复记录 2026-10-26</w:t>
+      </w:r>
+    </w:p>
+    <w:p>
+      <w:r>
+        <w:t>本节记录针对 PR #149 后续审查提出的问题所做的追加修复。它不改变 v5 默认关闭、按账号和资源灰度的发布策略，也不把本地通过视为生产验收。</w:t>
+      </w:r>
+    </w:p>
+    <w:p>
+      <w:pPr>
+        <w:pStyle w:val="Heading2"/>
+      </w:pPr>
+      <w:r>
+        <w:t>代码调整</w:t>
+      </w:r>
+    </w:p>
+    <w:p>
+      <w:r>
+        <w:t>客户端在传统 v4 同步前重新读取服务端 v5 capability 并设置 Schedule 权威状态，避免新账号首次进入灰度时因本地旧标志尚未写入而由 v4 拉取覆盖 Schedule。v5 同步在远端分页前捕获本地修改，并在每页正文返回后、IndexedDB 事务提交前再次捕获；待上传操作会在同一资源页提交期间覆盖远端值，游标仍与记录及 Schedule 文档原子提交。</w:t>
+      </w:r>
+    </w:p>
+    <w:p>
+      <w:r>
+        <w:t>同步状态中的 v5 待处理操作和冲突查询统一使用当前账号的 IndexedDB databaseScope，避免把用户 ID 当作数据库名称导致状态计数丢失。</w:t>
+      </w:r>
+    </w:p>
+    <w:p>
+      <w:r>
+        <w:t>服务端验证 recordId 所属领域与请求 scope 一致，拒绝例如 cue scope 写入 timetable 记录。v5 资源写入前后比较当前完整 Schedule 投影，保护诊断原始答案、来源标识、复习事件和首次作答证据；已确认回执的重复重放不再重建兼容投影或推进 v4 投影版本。</w:t>
+      </w:r>
+    </w:p>
+    <w:p>
+      <w:r>
+        <w:t>v4 兼容桥先按原始请求体限制大小并验证输入，再允许经过校验的紧凑 Schedule delta 在服务端展开为大投影后走大对象内部校验路径；原始客户端操作仍用于幂等请求哈希。</w:t>
+      </w:r>
+    </w:p>
+    <w:p>
+      <w:r>
+        <w:t>Azure Docker build context 与镜像 COPY 清单已加入共享 resource-model.ts，避免 v5 后端在容器发布中缺少运行时依赖。</w:t>
+      </w:r>
+    </w:p>
+    <w:p>
+      <w:r>
+        <w:t>针对后续审查新增两项数据安全修复：v5 回执确认按 revision 单调保留缓存中的较新记录，并在同一 IndexedDB 事务中删除已确认 outbox、覆盖剩余本地操作与冲突并重建 Schedule 文档；事务完成后再刷新 localStorage 投影。v4 不可用而回退 v3 时，v5 所有的 Schedule 描述不会被读取或协调，本地修改保持不变。</w:t>
+      </w:r>
+    </w:p>
+    <w:p>
+      <w:r>
+        <w:t>分片用户进度继续统一显示已接收的唯一分片数和下载状态；主要进度不以并发请求编号冒充完成数量。</w:t>
+      </w:r>
+    </w:p>
+    <w:p>
+      <w:pPr>
+        <w:pStyle w:val="Heading2"/>
+      </w:pPr>
+      <w:r>
+        <w:t>追加验证</w:t>
+      </w:r>
+    </w:p>
+    <w:p>
+      <w:r>
+        <w:t>本地后端及客户端重点测试：49 项通过，覆盖 v5 HTTP 路由、scope 隔离、不可变学习证据、重复回执、投影更新和 Docker 依赖。完整仓库 Node 回归：903 项通过。</w:t>
+      </w:r>
+    </w:p>
+    <w:p>
+      <w:r>
+        <w:t>ESLint：0 错误、2 条既有 warning。Next.js 16.3.8 webpack 生产构建及 TypeScript 检查通过。</w:t>
+      </w:r>
+    </w:p>
+    <w:p>
+      <w:r>
+        <w:t>完整 Azure Functions 打包、PostgreSQL 实际迁移/事务测试、认证账号生产读写及跨设备验收仍需后续证据；数据库迁移未执行，v5 必须保持默认关闭。</w:t>
+      </w:r>
+    </w:p>
+    <w:p>
+      <w:r>
+        <w:t>CI 的最后已确认结果仍是 run 40208803419 的生产 UI 流程失败，之前的 build、type/lint 和 existing data-safety gate 通过。之后 run 40210043882 的最终状态本轮未能从 GitHub 服务刷新；合并前必须重新确认该 run 和最新 head 的全部 required checks。</w:t>
+      </w:r>
+    </w:p>
+    <w:p>
+      <w:r>
+        <w:t>Vercel Preview 之前对 b2f41c7 达到 READY，health 返回 200，未认证 v5 capabilities 返回 v5=false。上述检查不代表本轮新提交已部署，更不代表生产认证读写通过。</w:t>
+      </w:r>
+    </w:p>
+    <w:p>
+      <w:pPr>
+        <w:pStyle w:val="Heading2"/>
+      </w:pPr>
+      <w:r>
+        <w:t>当前合并判断</w:t>
+      </w:r>
+    </w:p>
+    <w:p>
+      <w:r>
+        <w:t>追加修复已在本地隔离分支实现并通过本地代码门禁，但在最新 GitHub required checks、Azure 实际构建与目标环境验收刷新之前，不应将 PR 合并，也不应执行数据库迁移或扩大 v5 灰度。</w:t>
       </w:r>
     </w:p>
     <w:sectPr>

</xml_diff>

<commit_message>
feat(sync): complete page-scoped v5 client sync
</commit_message>
<xml_diff>
--- a/jackyun-portal/docs/sync-resource-v5-3.45.0.docx
+++ b/jackyun-portal/docs/sync-resource-v5-3.45.0.docx
@@ -515,6 +515,82 @@
     <w:p>
       <w:r>
         <w:t>追加修复已在本地隔离分支实现并通过本地代码门禁，但在最新 GitHub required checks、Azure 实际构建与目标环境验收刷新之前，不应将 PR 合并，也不应执行数据库迁移或扩大 v5 灰度。</w:t>
+      </w:r>
+    </w:p>
+    <w:p>
+      <w:r>
+        <w:br w:type="page"/>
+      </w:r>
+    </w:p>
+    <w:p>
+      <w:r>
+        <w:rPr>
+          <w:b/>
+          <w:sz w:val="32"/>
+        </w:rPr>
+        <w:t>客户端资源同步闭环补充 2026年10月26日</w:t>
+      </w:r>
+    </w:p>
+    <w:p>
+      <w:r>
+        <w:t>本补充记录 PR #149 合并后的客户端资源同步实现。Portal 更新至 3.46.0，Azure Functions 源码包更新至 3.9.0。本次工作仍保持 v5 默认关闭；是否启用由服务端账号能力决定，不按设备类型随机选择协议。 服务端可按账号授权一个或多个领域 scope；客户端仅同步获准领域，其他 Schedule 数据继续由 v4 兼容路径维护。只有全部领域授权时才停止 v4 Schedule 同步；撤销完整授权会在能力刷新时恢复 v4。</w:t>
+      </w:r>
+    </w:p>
+    <w:p>
+      <w:r>
+        <w:rPr>
+          <w:b/>
+          <w:sz w:val="26"/>
+        </w:rPr>
+        <w:t>页面订阅与游标</w:t>
+      </w:r>
+    </w:p>
+    <w:p>
+      <w:r>
+        <w:t>客户端依据当前 pathname 选择资源字段，并为每个 scope 与 field 保存独立游标。课表、学习、CUE 复习、活动、计时器、IELTS、设置等页面只订阅其当前使用的 Schedule 字段；未知或独立于 Schedule 的页面不会伪装成已接入资源同步。CUE 复习页不再因订阅 cues 而下载变更历史和集合更新等无关集合。</w:t>
+      </w:r>
+    </w:p>
+    <w:p>
+      <w:r>
+        <w:t>首次基线以暂存页方式下载。每页正文先通过 SHA-256 校验并写入 IndexedDB；基线未完整前不会更新可见 Schedule。最终页在同一 IndexedDB 事务中提交资源、元数据、必要冲突/操作状态和字段游标。检测到本地与远端不同的初始值时保留本地并形成冲突，不以云端基线静默覆盖。</w:t>
+      </w:r>
+    </w:p>
+    <w:p>
+      <w:r>
+        <w:rPr>
+          <w:b/>
+          <w:sz w:val="26"/>
+        </w:rPr>
+        <w:t>增量与兼容行为</w:t>
+      </w:r>
+    </w:p>
+    <w:p>
+      <w:r>
+        <w:t>变化查询和基线查询均可按字段过滤，并使用独立字段游标，避免在页面间切换时用一个 scope 游标跳过另一字段的事件。服务端 manifest 与 changes 的记录及 head 在单条 SQL 语句快照中读取，防止两次 READ COMMITTED 查询之间发生写入而提前推进游标。写入仍使用 baseRevision/baseHash、稳定 operation ID 和 receipt；收到旧回执不得回退较新的本地资源。</w:t>
+      </w:r>
+    </w:p>
+    <w:p>
+      <w:r>
+        <w:t>v4 仍作为兼容与恢复路径。v5 失败不会自动把旧快照全量上传。Azure 真实 PostgreSQL 迁移、认证生产读写以及跨设备回滚仍需要独立环境和凭据验证；在此之前不得开放生产账号灰度。</w:t>
+      </w:r>
+    </w:p>
+    <w:p>
+      <w:r>
+        <w:rPr>
+          <w:b/>
+          <w:sz w:val="26"/>
+        </w:rPr>
+        <w:t>本轮验证</w:t>
+      </w:r>
+    </w:p>
+    <w:p>
+      <w:r>
+        <w:t>本地 Node 回归覆盖 v5 路由、能力默认关闭、scope 校验、条件写入、幂等回执、删除/冲突兼容、字段游标独立、首次基线冲突保留、分页基线不提前显示、旧回执不覆盖新值，以及未知根字段投影往返。重复打开同一字段不会再次请求正文；修改单条 CUE 只排入该 CUE 记录操作。</w:t>
+      </w:r>
+    </w:p>
+    <w:p>
+      <w:r>
+        <w:t>本地与模拟 API 测试不代表真实 PostgreSQL 或生产往返。发布前仍须核对 CI、生产 SHA、Vercel READY、Azure 认证读写及回读哈希；跨设备只用专用账号验收。</w:t>
       </w:r>
     </w:p>
     <w:sectPr>

</xml_diff>

<commit_message>
fix(sync): cover writable v5 resource fields
</commit_message>
<xml_diff>
--- a/jackyun-portal/docs/sync-resource-v5-3.45.0.docx
+++ b/jackyun-portal/docs/sync-resource-v5-3.45.0.docx
@@ -591,6 +591,58 @@
     <w:p>
       <w:r>
         <w:t>本地与模拟 API 测试不代表真实 PostgreSQL 或生产往返。发布前仍须核对 CI、生产 SHA、Vercel READY、Azure 认证读写及回读哈希；跨设备只用专用账号验收。</w:t>
+      </w:r>
+    </w:p>
+    <w:p>
+      <w:pPr>
+        <w:pStyle w:val="Heading1"/>
+      </w:pPr>
+      <w:r>
+        <w:t>同步字段覆盖修复 2026年10月26日</w:t>
+      </w:r>
+    </w:p>
+    <w:p>
+      <w:r>
+        <w:t>对 PR #150 合并后的代码审查发现，页面订阅表有四个可写字段没有任何入口：cueCollectionUpdates、cueChangeHistory、cueSimilarityDecisions 和 studyReports。当账号获得全部 v5 scope 后，Schedule 的 v4 整体写入会停止；如果当前页面不订阅这些字段，本地修改就不会被 v5 的捕获逻辑发现。另有两个 scope 错配：study 页面把 practiceSessions 标为 practice，activity 页面把 practiceFrequencies 标为 learning，均会被同步目标校验静默过滤。</w:t>
+      </w:r>
+    </w:p>
+    <w:p>
+      <w:r>
+        <w:t>修复后，Schedule 页面为 CUE 集合更新、变更历史、相似度决策和学习报告建立合法订阅；practiceSessions 改为 timer scope，practiceFrequencies 改为 practice scope。仍按 pathname 只同步当前页面所需字段，例如 Review 页面不会因此加载 CUE 全量历史，Schedule 也不订阅无关的 examDiagnoses。Portal 版本从 3.46.0 更新为 3.46.1。</w:t>
+      </w:r>
+    </w:p>
+    <w:p>
+      <w:r>
+        <w:t>新增的路由契约测试枚举所有 v5 scope 和字段，要求每个可写字段至少有一个 scope 完全匹配的页面目标，并检查以上两个错配及 Schedule 页面不加载无关练习历史。这样新增资源字段或调整 scope 时，覆盖缺口会在自动化测试中直接失败。</w:t>
+      </w:r>
+    </w:p>
+    <w:p>
+      <w:pPr>
+        <w:pStyle w:val="Heading2"/>
+      </w:pPr>
+      <w:r>
+        <w:t>本地验证</w:t>
+      </w:r>
+    </w:p>
+    <w:p>
+      <w:r>
+        <w:t>v5 客户端与资源模型定向测试 17 项全部通过。完整 test:sync 套件 214 项全部通过；修改文件 ESLint 通过；Next.js 16.3.8 Webpack 生产构建通过，包含 /api/sync/v5 路由；构建生成 Next 路由类型后，TypeScript --noEmit 通过。</w:t>
+      </w:r>
+      <w:r>
+        <w:t xml:space="preserve"> DOCX 原生渲染器缺少可用的打包 LibreOffice；本次使用 Edge HTML 打印预览检查五页近似版面，未发现溢出或重叠，但该预览不等同于 Word 或 LibreOffice 原生渲染，后续仍需原生版式复核。</w:t>
+      </w:r>
+    </w:p>
+    <w:p>
+      <w:pPr>
+        <w:pStyle w:val="Heading2"/>
+      </w:pPr>
+      <w:r>
+        <w:t>发布边界</w:t>
+      </w:r>
+    </w:p>
+    <w:p>
+      <w:r>
+        <w:t>本补充记录形成时，字段覆盖修复尚未合并，CI 与生产部署验收待 PR 检查。v5 仍默认关闭；Azure Functions 发布、sync-v5.sql 生产迁移、认证读写、跨设备往返和生产性能数据均不由本地测试推定，须在具备受控测试账号、备份和 Azure 权限后单独验证。</w:t>
       </w:r>
     </w:p>
     <w:sectPr>

</xml_diff>

<commit_message>
docs(sync): record final PR review gate status
</commit_message>
<xml_diff>
--- a/jackyun-portal/docs/sync-resource-v5-3.45.0.docx
+++ b/jackyun-portal/docs/sync-resource-v5-3.45.0.docx
@@ -643,6 +643,25 @@
     <w:p>
       <w:r>
         <w:t>本补充记录形成时，字段覆盖修复尚未合并，CI 与生产部署验收待 PR 检查。v5 仍默认关闭；Azure Functions 发布、sync-v5.sql 生产迁移、认证读写、跨设备往返和生产性能数据均不由本地测试推定，须在具备受控测试账号、备份和 Azure 权限后单独验证。</w:t>
+      </w:r>
+    </w:p>
+    <w:p>
+      <w:r>
+        <w:rPr>
+          <w:b/>
+          <w:sz w:val="24"/>
+        </w:rPr>
+        <w:t>PR #151 最终检查状态 2026年10月26日</w:t>
+      </w:r>
+    </w:p>
+    <w:p>
+      <w:r>
+        <w:t>最终提交 894d617 的 GitHub Actions run 40229133333：Next.js build、Type/lint checks、Existing data safety regressions 均通过；Run production UI flows 失败。失败项与本次 v5 字段路由改动无关，且与同一 PR 第一提交的 run 40228606841 逐项一致，包括既有离线提示、React/legacy UI 选择、评估恢复、移动端日程入口和若干超时断言。故 CI 不是全绿，合并决定需按仓库保护规则处理；不得将此结果描述为 UI 验收通过。</w:t>
+      </w:r>
+    </w:p>
+    <w:p>
+      <w:r>
+        <w:t>本地针对性 v5 客户端测试 13 项通过，完整 test:sync 214 项通过，改动文件 ESLint 和 git diff --check 通过。生产 Vercel 部署、Azure 真实数据库迁移与认证读写、跨设备账号验收仍未验证；v5 继续默认关闭。</w:t>
       </w:r>
     </w:p>
     <w:sectPr>

</xml_diff>

<commit_message>
feat(sync): add collapsible sync diagnostics
</commit_message>
<xml_diff>
--- a/jackyun-portal/docs/sync-resource-v5-3.45.0.docx
+++ b/jackyun-portal/docs/sync-resource-v5-3.45.0.docx
@@ -662,6 +662,35 @@
     <w:p>
       <w:r>
         <w:t>本地针对性 v5 客户端测试 13 项通过，完整 test:sync 214 项通过，改动文件 ESLint 和 git diff --check 通过。生产 Vercel 部署、Azure 真实数据库迁移与认证读写、跨设备账号验收仍未验证；v5 继续默认关闭。</w:t>
+      </w:r>
+    </w:p>
+    <w:p>
+      <w:r>
+        <w:rPr>
+          <w:b/>
+          <w:sz w:val="24"/>
+        </w:rPr>
+        <w:t>同步诊断入口与版本一致性修复 2026年10月26日</w:t>
+      </w:r>
+    </w:p>
+    <w:p>
+      <w:r>
+        <w:t>合并后的 portal manifest 与客户端 APP_VERSION 出现版本漂移：package.json/package-lock.json 为 3.46.1，但同步遥测、BETA 与更新页仍引用 3.44.4。该问题会让诊断事件标记错误版本，也使用户看到的版本不可信。本阶段按新增诊断体验升级到 3.47.0，并以测试保证 package、lock、APP_VERSION 和最新更新记录一致。</w:t>
+      </w:r>
+    </w:p>
+    <w:p>
+      <w:r>
+        <w:t>顶栏状态按钮保留原有“立即重试”行为；当存在同步状态、待上传项、冲突或本机保存问题时，旁边的更多操作可展开原生 details 诊断面板。面板展示用户可行动的状态、进度、待上传和冲突数量、最近成功时间及连续失败次数；不直接回显服务端原始错误正文。面板可跳转同步中心处理冲突，也可打开高级设置中的完整本地客户端日志。普通 503 等待重试不触发 alert；本机保存失败仍以明确的高优先级状态显示。</w:t>
+      </w:r>
+    </w:p>
+    <w:p>
+      <w:r>
+        <w:t>本地验证：全量 test:sync 214 项通过；版本与更新历史测试通过；新增浏览器测试在 390px 和 1440px 视口验证展开、边界、不打断错误、敏感原文不显示及重试事件；改动文件 ESLint、TypeScript --noEmit、Next.js 16.3.8 Webpack production build 和 git diff --check 均通过。</w:t>
+      </w:r>
+    </w:p>
+    <w:p>
+      <w:r>
+        <w:t>发布边界：本阶段尚未推送代码，GitHub CI 和对应 SHA 的 Vercel 部署仍待 PR 验证。Azure 真实 PostgreSQL 迁移、认证账号读写回读哈希、手机/电脑跨设备验收、物理 PWA/手机弱网验收及升级前后流量/服务器负载基准对比均未完成。缺少测试账号和 Azure 权限期间，v5 必须继续默认关闭，不得以预览部署代替生产验收。</w:t>
       </w:r>
     </w:p>
     <w:sectPr>

</xml_diff>

<commit_message>
fix(sync): keep diagnostics visible on mobile
</commit_message>
<xml_diff>
--- a/jackyun-portal/docs/sync-resource-v5-3.45.0.docx
+++ b/jackyun-portal/docs/sync-resource-v5-3.45.0.docx
@@ -691,6 +691,30 @@
     <w:p>
       <w:r>
         <w:t>发布边界：本阶段尚未推送代码，GitHub CI 和对应 SHA 的 Vercel 部署仍待 PR 验证。Azure 真实 PostgreSQL 迁移、认证账号读写回读哈希、手机/电脑跨设备验收、物理 PWA/手机弱网验收及升级前后流量/服务器负载基准对比均未完成。缺少测试账号和 Azure 权限期间，v5 必须继续默认关闭，不得以预览部署代替生产验收。</w:t>
+      </w:r>
+    </w:p>
+    <w:p>
+      <w:r>
+        <w:rPr>
+          <w:b/>
+          <w:sz w:val="24"/>
+        </w:rPr>
+        <w:t>移动诊断面板审查修复 2026年10月26日</w:t>
+      </w:r>
+    </w:p>
+    <w:p>
+      <w:r>
+        <w:t>PR 自动审查发现，原面板相对状态按钮定位；真实手机顶栏中按钮右侧还有通知、更多操作和头像，面板可能越过视口左边界，并被顶栏祖先的 overflow-hidden 裁切。现将面板通过 React portal 挂载到 document.body，使用 fixed 定位，按触发按钮的视口坐标计算位置并保持 12px 安全边距；滚动和窗口尺寸变化时重新定位。</w:t>
+      </w:r>
+    </w:p>
+    <w:p>
+      <w:r>
+        <w:t>浏览器回归夹具现在模拟完整顶栏右侧后续操作和裁切容器，并验证 390px 与 1440px 下诊断面板完整落在视口内、实际面板位于 body 且使用 fixed 定位、同步中心和日志链接可见、重试事件正常触发。专项浏览器测试、改动文件 ESLint、TypeScript --noEmit 均通过。PR CI 的生产构建、类型/lint、数据安全回归通过；生产 UI 流程中的 11 个失败与 PR #151 两次既有基线运行一致，本次新增 sync-status-indicator 流程通过。</w:t>
+      </w:r>
+    </w:p>
+    <w:p>
+      <w:r>
+        <w:t>本次 PR 仍未合并，云端 PR 检查和部署验收继续追踪。生产 Azure 数据库迁移、认证真实账号读写回执与哈希回读、跨设备及物理手机弱网验收、升级前后流量和服务器负载基准仍未完成，v5 继续默认关闭。</w:t>
       </w:r>
     </w:p>
     <w:sectPr>

</xml_diff>

<commit_message>
docs(sync): record 3.47.0 production verification
</commit_message>
<xml_diff>
--- a/jackyun-portal/docs/sync-resource-v5-3.45.0.docx
+++ b/jackyun-portal/docs/sync-resource-v5-3.45.0.docx
@@ -715,6 +715,35 @@
     <w:p>
       <w:r>
         <w:t>本次 PR 仍未合并，云端 PR 检查和部署验收继续追踪。生产 Azure 数据库迁移、认证真实账号读写回执与哈希回读、跨设备及物理手机弱网验收、升级前后流量和服务器负载基准仍未完成，v5 继续默认关闭。</w:t>
+      </w:r>
+    </w:p>
+    <w:p>
+      <w:r>
+        <w:rPr>
+          <w:b/>
+          <w:sz w:val="24"/>
+        </w:rPr>
+        <w:t>合并与生产部署验收 2026年10月26日</w:t>
+      </w:r>
+    </w:p>
+    <w:p>
+      <w:r>
+        <w:t>PR #152 已合并至 main，GitHub merge commit 为 7ab4c01c9a994b45a9210ab51e94c57167a3a71b；隔离仓库 origin/main 已刷新并与该提交一致。生产 Vercel deployment dpl_3TPQrorEqDVDu4B45XC77sDqHynd 状态 READY，source SHA 完全匹配合并提交，并绑定 jackyun.top。生产 /api/health 返回 HTTP 200。</w:t>
+      </w:r>
+    </w:p>
+    <w:p>
+      <w:r>
+        <w:t>生产 /api/sync/v5 未能完成端点验收：Vercel 受保护部署读取器在部署认证层拦截请求，公开域名网络请求也无法从当前执行环境直连。未提供测试账号和 Azure 凭据，因此未尝试或宣称认证读写、数据库回执、哈希回读或跨设备一致性。PR 预览 deployment 对应代码 SHA b5762bf 为 READY，其 /api/health 返回 200，/api/sync/v5 返回 capabilities.v5=false；Cloudflare 预览部署对同一代码 SHA 报告成功。</w:t>
+      </w:r>
+    </w:p>
+    <w:p>
+      <w:r>
+        <w:t>最终 GitHub workflow 40234838903 的 build、Type/lint、data safety 均成功；生产 UI flows 有 11 个既有失败，与 PR #151 的两次运行 40229133333 和 40228606841 的失败套件逐项一致。新增 sync-status-indicator 浏览器测试在 CI 通过。本次本地验证还包括同步套件 214/214、版本测试 3/3、390px/1440px 诊断面板布局、ESLint、TypeScript --noEmit 和生产构建。</w:t>
+      </w:r>
+    </w:p>
+    <w:p>
+      <w:r>
+        <w:t>发布判定：3.47.0 诊断体验与版本一致性已部署；整项 v5 资源级同步尚未完成生产验收。Azure PostgreSQL 迁移、认证账号读写回执与哈希回读、真实手机/电脑跨设备同步、弱网/上传恢复及升级前后流量和服务器负载测量仍待完成。v5 必须保持默认关闭，不能以 READY 状态或无认证健康检查代替这些门槛。</w:t>
       </w:r>
     </w:p>
     <w:sectPr>

</xml_diff>